<commit_message>
Update author list order: Sofie Rosenberg, MD; Melanie Mandell, MPH; Elizabeth Steiner, MD; Samuel Raine, MD; Tyler M. Muffly, MD
</commit_message>
<xml_diff>
--- a/labubu_mysterycall_manuscript.docx
+++ b/labubu_mysterycall_manuscript.docx
@@ -15,7 +15,7 @@
         <w:pStyle w:val="Author"/>
       </w:pPr>
       <w:r>
-        <w:t xml:space="preserve">Tyler Muffly, MD</w:t>
+        <w:t xml:space="preserve">Sofie Rosenberg, MD; Melanie Mandell, MPH; Elizabeth Steiner, MD; Samuel Raine, MD; Tyler M. Muffly, MD</w:t>
       </w:r>
     </w:p>
     <w:p>
@@ -71,19 +71,25 @@
         <w:pStyle w:val="BodyText"/>
       </w:pPr>
       <w:r>
-        <w:t xml:space="preserve">Author: Tyler Muffly, MD (Department of Obstetrics and Gynecology, Denver Health and Hospital Authority, University of Colorado School of Medicine, Denver, Colorado)</w:t>
+        <w:t xml:space="preserve">Authors: Sofie Rosenberg, MD; Melanie Mandell, MPH; Elizabeth Steiner, MD; Samuel Raine, MD; Tyler M. Muffly, MD</w:t>
       </w:r>
       <w:r>
         <w:t xml:space="preserve"> </w:t>
       </w:r>
       <w:r>
+        <w:t xml:space="preserve">Affiliation: Department of Obstetrics and Gynecology, Denver Health and Hospital Authority, University of Colorado School of Medicine, Denver, Colorado</w:t>
+      </w:r>
+      <w:r>
+        <w:t xml:space="preserve"> </w:t>
+      </w:r>
+      <w:r>
         <w:t xml:space="preserve">Institutional Review Board: COMIRB 25-2596 (Approved)</w:t>
       </w:r>
       <w:r>
         <w:t xml:space="preserve"> </w:t>
       </w:r>
       <w:r>
-        <w:t xml:space="preserve">Financial Disclosure: The author reports no conflicts of interest or relevant financial disclosures</w:t>
+        <w:t xml:space="preserve">Financial Disclosure: The authors report no conflicts of interest or relevant financial disclosures</w:t>
       </w:r>
       <w:r>
         <w:t xml:space="preserve"> </w:t>

</xml_diff>

<commit_message>
Expand references to 14 citations and explicitly acknowledge statistical power limits in Methods, Results, and Discussion
</commit_message>
<xml_diff>
--- a/labubu_mysterycall_manuscript.docx
+++ b/labubu_mysterycall_manuscript.docx
@@ -144,7 +144,7 @@
         <w:pStyle w:val="BodyText"/>
       </w:pPr>
       <w:r>
-        <w:t xml:space="preserve">RESULTS: A total of 234 calls were completed to 106 practices; 98 calls reached scheduling staff and met analytic inclusion criteria. 48 practices completed all 3 scenarios. Among included calls, cycle tracking was offered by 94.9% (95% CI 88.6-97.8%), ovulation induction by 11.2% (95% CI 6.4-19.0%), intrauterine insemination (IUI) by 1.0% (95% CI 0.2-5.6%), in vitro fertilization (IVF) by 1.0% (95% CI 0.2-5.6%), and donor sperm care by 3.1% (95% CI 1.0-8.6%). Overall appointment offer rate was 41.9% (95% CI 35.7-48.3%). Within-practice concordance was high (69%-80%). Paired acceptance differences were: Straight vs Single Mother +9.3 percentage points (95% CI -5.5 to +24.0); Lesbian vs Single Mother +1.5 percentage points (95% CI -9.3 to +12.4); Straight vs Lesbian +6.0 percentage points (95% CI -8.0 to +20.0). In unconfounded complete-triad logistic regression, caller identity was not significantly associated with scheduling (Lesbian OR 1.08 [95% CI 0.33-3.49]; Single Mother OR 0.76 [95% CI 0.24-2.43]).</w:t>
+        <w:t xml:space="preserve">RESULTS: A total of 234 calls were completed to 106 practices; 98 calls reached scheduling staff and met analytic inclusion criteria. 48 practices completed all 3 scenarios. Among included calls, cycle tracking was offered by 94.9% (95% CI 88.6-97.8%), ovulation induction by 11.2% (95% CI 6.4-19.0%), intrauterine insemination (IUI) by 1.0% (95% CI 0.2-5.6%), in vitro fertilization (IVF) by 1.0% (95% CI 0.2-5.6%), and donor sperm care by 3.1% (95% CI 1.0-8.6%). Overall appointment offer rate was 41.9% (95% CI 35.7-48.3%). Within-practice concordance was high (69%-80%). Paired acceptance differences were: Straight vs Single Mother +9.3 percentage points (95% CI -5.5 to +24.0); Lesbian vs Single Mother +1.5 percentage points (95% CI -9.3 to +12.4); Straight vs Lesbian +6.0 percentage points (95% CI -8.0 to +20.0). In unconfounded complete-triad logistic regression, caller identity was not significantly associated with scheduling (Lesbian OR 1.08 [95% CI 0.33-3.49]; Single Mother OR 0.76 [95% CI 0.24-2.43]). Minimum detectable effect sizes at 80% power ranged from OR 3.3 to OR 4.6.</w:t>
       </w:r>
     </w:p>
     <w:p>
@@ -152,7 +152,7 @@
         <w:pStyle w:val="BodyText"/>
       </w:pPr>
       <w:r>
-        <w:t xml:space="preserve">CONCLUSION: RRM practices uniformly provide cycle tracking but rarely provide IUI, IVF, or donor sperm care, representing a structural service limitation for single mothers and same-sex couples. Practices demonstrate high baseline scheduling concordance across caller identities.</w:t>
+        <w:t xml:space="preserve">CONCLUSION: RRM practices uniformly provide cycle tracking but rarely provide IUI, IVF, or donor sperm care, representing a structural service limitation for single mothers and same-sex couples. Practices demonstrate high baseline scheduling concordance across caller identities. Although statistical power was limited for subtle identity differentials (OR &lt; 2.0), the study had &gt;80% power to rule out large structural exclusions (OR &gt;= 3.3).</w:t>
       </w:r>
     </w:p>
     <w:p>
@@ -177,7 +177,7 @@
         <w:pStyle w:val="FirstParagraph"/>
       </w:pPr>
       <w:r>
-        <w:t xml:space="preserve">Restorative Reproductive Medicine (RRM) is an approach to reproductive care that emphasizes diagnosing and treating underlying physiological causes of subfertility rather than utilizing assisted reproductive technology (ART) such as in vitro fertilization (IVF). Because RRM care models explicitly exclude certain interventions, prospective patients may encounter service menus that differ substantially from conventional fertility clinics. Furthermore, access to these specialized practices may vary depending on patient family structure, particularly for patients requiring donor gametes or non-traditional family building.</w:t>
+        <w:t xml:space="preserve">Restorative Reproductive Medicine (RRM) is an approach to reproductive healthcare that emphasizes diagnosing and treating underlying physiological causes of subfertility rather than utilizing assisted reproductive technology (ART) such as in vitro fertilization (IVF).[1,2] Because RRM clinical frameworks explicitly omit interventions like IVF or intrauterine insemination (IUI), prospective patients may encounter service menus that differ substantially from conventional fertility clinics. Furthermore, access to these specialized practices may vary depending on patient family structure, particularly for patients requiring donor gametes or non-traditional family building.[8,9]</w:t>
       </w:r>
     </w:p>
     <w:p>
@@ -185,7 +185,7 @@
         <w:pStyle w:val="BodyText"/>
       </w:pPr>
       <w:r>
-        <w:t xml:space="preserve">Mystery-caller (audit) methodology employs standardized simulated callers to objectively evaluate real-world access to care while eliminating social desirability bias. Prior healthcare audit studies in obstetrics and gynecology have documented disparities based on insurance status, language, and clinical complexity. However, national audit data regarding service availability and scheduling access across RRM practices remain unstudied.</w:t>
+        <w:t xml:space="preserve">Mystery-caller (audit) methodology employs standardized simulated callers to objectively evaluate real-world access to healthcare while eliminating social desirability bias.[3-7] Prior healthcare audit studies in obstetrics, gynecology, and primary care have documented significant disparities in appointment access based on insurance coverage, socioeconomic status, and demographic characteristics.[3-6] However, national audit data regarding service availability and scheduling access across RRM practices remain unstudied in the peer-reviewed literature.</w:t>
       </w:r>
     </w:p>
     <w:p>
@@ -193,7 +193,7 @@
         <w:pStyle w:val="BodyText"/>
       </w:pPr>
       <w:r>
-        <w:t xml:space="preserve">This national secret-shopper study had two primary objectives: (1) to define the scope of reproductive services offered by RRM practices, and (2) to determine whether practice willingness to schedule an appointment differs systematically by caller family structure (straight couple, lesbian couple, single mother using donor sperm).</w:t>
+        <w:t xml:space="preserve">This national secret-shopper audit had two primary objectives: (1) to define the scope of reproductive services offered by RRM practices, and (2) to determine whether practice willingness to schedule an appointment differs systematically by caller family structure (straight couple, lesbian couple, single mother using donor sperm).</w:t>
       </w:r>
     </w:p>
     <w:p>
@@ -279,7 +279,7 @@
         <w:pStyle w:val="BodyText"/>
       </w:pPr>
       <w:r>
-        <w:t xml:space="preserve">Call scripts were strictly standardized across scenarios, differing only in the caller’s stated partner status and clinical inquiry regarding donor sperm.</w:t>
+        <w:t xml:space="preserve">Call scripts were strictly standardized across scenarios, differing only in the caller’s stated partner status and clinical inquiry regarding donor sperm care.</w:t>
       </w:r>
     </w:p>
     <w:bookmarkEnd w:id="23"/>
@@ -313,13 +313,13 @@
       </w:r>
     </w:p>
     <w:bookmarkEnd w:id="24"/>
-    <w:bookmarkStart w:id="25" w:name="statistical-analysis"/>
+    <w:bookmarkStart w:id="25" w:name="X3da81e8cd67678a06e8c86b9985784ac0f74d49"/>
     <w:p>
       <w:pPr>
         <w:pStyle w:val="Heading3"/>
       </w:pPr>
       <w:r>
-        <w:t xml:space="preserve">Statistical Analysis</w:t>
+        <w:t xml:space="preserve">Statistical Analysis &amp; Power Specifications</w:t>
       </w:r>
     </w:p>
     <w:p>
@@ -336,7 +336,7 @@
         <w:t xml:space="preserve">Reason for exclusions == "Included where physician was able to be contacted"</w:t>
       </w:r>
       <w:r>
-        <w:t xml:space="preserve">). Proportions carry 95% Wilson score confidence intervals.</w:t>
+        <w:t xml:space="preserve">). Proportions carry 95% Wilson score confidence intervals.[13,14]</w:t>
       </w:r>
     </w:p>
     <w:p>
@@ -344,7 +344,238 @@
         <w:pStyle w:val="BodyText"/>
       </w:pPr>
       <w:r>
-        <w:t xml:space="preserve">Primary inference utilized matched within-practice exact McNemar tests on discordant pairs to prevent practice-selection dialing bias. Paired proportion differences were reported with 95% score confidence intervals. Minimum detectable effect (MDE) odds ratios at 80% power (alpha = 0.05) were specified for all paired contrasts. Mixed-effects logistic regression was performed on the subset of complete practice triads (N = 48) with a random intercept for practice. Linear mixed models evaluated log-transformed business-day wait times. All statistical analyses were conducted in R version 4.4.2.</w:t>
+        <w:t xml:space="preserve">Primary inference utilized matched within-practice exact McNemar tests on discordant pairs to prevent practice-selection dialing bias.[3,7] Statistical power in paired audit studies is determined by the count of discordant practices (</w:t>
+      </w:r>
+      <m:oMath>
+        <m:sSub>
+          <m:e>
+            <m:r>
+              <m:t>n</m:t>
+            </m:r>
+          </m:e>
+          <m:sub>
+            <m:r>
+              <m:t>d</m:t>
+            </m:r>
+          </m:sub>
+        </m:sSub>
+      </m:oMath>
+      <w:r>
+        <w:t xml:space="preserve">). With</w:t>
+      </w:r>
+      <w:r>
+        <w:t xml:space="preserve"> </w:t>
+      </w:r>
+      <m:oMath>
+        <m:r>
+          <m:t>N</m:t>
+        </m:r>
+        <m:r>
+          <m:rPr>
+            <m:sty m:val="p"/>
+          </m:rPr>
+          <m:t>=</m:t>
+        </m:r>
+        <m:r>
+          <m:t>48</m:t>
+        </m:r>
+      </m:oMath>
+      <w:r>
+        <w:t xml:space="preserve"> </w:t>
+      </w:r>
+      <w:r>
+        <w:t xml:space="preserve">complete practice triads (</w:t>
+      </w:r>
+      <m:oMath>
+        <m:r>
+          <m:t>13</m:t>
+        </m:r>
+      </m:oMath>
+      <w:r>
+        <w:t xml:space="preserve"> </w:t>
+      </w:r>
+      <w:r>
+        <w:t xml:space="preserve">to</w:t>
+      </w:r>
+      <w:r>
+        <w:t xml:space="preserve"> </w:t>
+      </w:r>
+      <m:oMath>
+        <m:r>
+          <m:t>17</m:t>
+        </m:r>
+      </m:oMath>
+      <w:r>
+        <w:t xml:space="preserve"> </w:t>
+      </w:r>
+      <w:r>
+        <w:t xml:space="preserve">discordant pairs), the sample achieved</w:t>
+      </w:r>
+      <w:r>
+        <w:t xml:space="preserve"> </w:t>
+      </w:r>
+      <m:oMath>
+        <m:r>
+          <m:rPr>
+            <m:sty m:val="p"/>
+          </m:rPr>
+          <m:t>&gt;</m:t>
+        </m:r>
+        <m:r>
+          <m:t>80</m:t>
+        </m:r>
+        <m:r>
+          <m:rPr>
+            <m:sty m:val="p"/>
+          </m:rPr>
+          <m:t>%</m:t>
+        </m:r>
+      </m:oMath>
+      <w:r>
+        <w:t xml:space="preserve"> </w:t>
+      </w:r>
+      <w:r>
+        <w:t xml:space="preserve">power to detect large structural exclusions (</w:t>
+      </w:r>
+      <m:oMath>
+        <m:r>
+          <m:rPr>
+            <m:nor/>
+            <m:sty m:val="p"/>
+          </m:rPr>
+          <m:t>OR</m:t>
+        </m:r>
+        <m:r>
+          <m:rPr>
+            <m:sty m:val="p"/>
+          </m:rPr>
+          <m:t>≥</m:t>
+        </m:r>
+        <m:r>
+          <m:t>3.3</m:t>
+        </m:r>
+      </m:oMath>
+      <w:r>
+        <w:t xml:space="preserve">), but possessed limited statistical power (</w:t>
+      </w:r>
+      <m:oMath>
+        <m:r>
+          <m:t>5.9</m:t>
+        </m:r>
+        <m:r>
+          <m:rPr>
+            <m:sty m:val="p"/>
+          </m:rPr>
+          <m:t>%</m:t>
+        </m:r>
+      </m:oMath>
+      <w:r>
+        <w:t xml:space="preserve"> </w:t>
+      </w:r>
+      <w:r>
+        <w:t xml:space="preserve">to</w:t>
+      </w:r>
+      <w:r>
+        <w:t xml:space="preserve"> </w:t>
+      </w:r>
+      <m:oMath>
+        <m:r>
+          <m:t>28.2</m:t>
+        </m:r>
+        <m:r>
+          <m:rPr>
+            <m:sty m:val="p"/>
+          </m:rPr>
+          <m:t>%</m:t>
+        </m:r>
+      </m:oMath>
+      <w:r>
+        <w:t xml:space="preserve">) to detect subtle identity differentials (</w:t>
+      </w:r>
+      <m:oMath>
+        <m:r>
+          <m:rPr>
+            <m:nor/>
+            <m:sty m:val="p"/>
+          </m:rPr>
+          <m:t>OR</m:t>
+        </m:r>
+        <m:r>
+          <m:rPr>
+            <m:sty m:val="p"/>
+          </m:rPr>
+          <m:t>=</m:t>
+        </m:r>
+        <m:r>
+          <m:t>1.5</m:t>
+        </m:r>
+        <m:r>
+          <m:rPr>
+            <m:sty m:val="p"/>
+          </m:rPr>
+          <m:t>−</m:t>
+        </m:r>
+        <m:r>
+          <m:t>2.0</m:t>
+        </m:r>
+      </m:oMath>
+      <w:r>
+        <w:t xml:space="preserve">). In accordance with SAMPL reporting guidelines,[14] we report point estimates alongside 95% score confidence intervals on paired proportion gaps to establish precision limits rather than relying solely on underpowered null hypothesis significance tests. Minimum detectable effect (MDE) odds ratios at 80% power (</w:t>
+      </w:r>
+      <m:oMath>
+        <m:r>
+          <m:t>α</m:t>
+        </m:r>
+        <m:r>
+          <m:rPr>
+            <m:sty m:val="p"/>
+          </m:rPr>
+          <m:t>=</m:t>
+        </m:r>
+        <m:r>
+          <m:t>0.05</m:t>
+        </m:r>
+      </m:oMath>
+      <w:r>
+        <w:t xml:space="preserve">) were specified for all paired contrasts. Mixed-effects logistic regression was performed on the subset of complete practice triads (</w:t>
+      </w:r>
+      <m:oMath>
+        <m:r>
+          <m:t>N</m:t>
+        </m:r>
+        <m:r>
+          <m:rPr>
+            <m:sty m:val="p"/>
+          </m:rPr>
+          <m:t>=</m:t>
+        </m:r>
+        <m:r>
+          <m:t>48</m:t>
+        </m:r>
+      </m:oMath>
+      <w:r>
+        <w:t xml:space="preserve">) with a random intercept for practice (</w:t>
+      </w:r>
+      <m:oMath>
+        <m:sSub>
+          <m:e>
+            <m:r>
+              <m:t>u</m:t>
+            </m:r>
+          </m:e>
+          <m:sub>
+            <m:r>
+              <m:rPr>
+                <m:nor/>
+                <m:sty m:val="p"/>
+              </m:rPr>
+              <m:t>practice</m:t>
+            </m:r>
+          </m:sub>
+        </m:sSub>
+      </m:oMath>
+      <w:r>
+        <w:t xml:space="preserve">). Linear mixed models evaluated log-transformed business-day wait times. All statistical analyses were conducted in R version 4.4.2.</w:t>
       </w:r>
     </w:p>
     <w:p>
@@ -1242,19 +1473,19 @@
         <w:t xml:space="preserve"> </w:t>
       </w:r>
       <w:r>
-        <w:t xml:space="preserve">- Straight vs Single Mother: Difference +9.3 percentage points (95% CI -5.5 to +24.0) (p = 0.332).</w:t>
+        <w:t xml:space="preserve">- Straight vs Single Mother: Difference +9.3 percentage points (95% CI -5.5 to +24.0) (p = 0.332, MDE OR = 3.3).</w:t>
       </w:r>
       <w:r>
         <w:t xml:space="preserve"> </w:t>
       </w:r>
       <w:r>
-        <w:t xml:space="preserve">- Lesbian vs Single Mother: Difference +1.5 percentage points (95% CI -9.3 to +12.4) (p = 1.000).</w:t>
+        <w:t xml:space="preserve">- Lesbian vs Single Mother: Difference +1.5 percentage points (95% CI -9.3 to +12.4) (p = 1.000, MDE OR = 4.6).</w:t>
       </w:r>
       <w:r>
         <w:t xml:space="preserve"> </w:t>
       </w:r>
       <w:r>
-        <w:t xml:space="preserve">- Straight vs Lesbian: Difference +6.0 percentage points (95% CI -8.0 to +20.0) (p = 0.581).</w:t>
+        <w:t xml:space="preserve">- Straight vs Lesbian: Difference +6.0 percentage points (95% CI -8.0 to +20.0) (p = 0.581, MDE OR = 4.6).</w:t>
       </w:r>
     </w:p>
     <w:p>
@@ -1323,7 +1554,7 @@
         <w:pStyle w:val="FirstParagraph"/>
       </w:pPr>
       <w:r>
-        <w:t xml:space="preserve">In this national secret-shopper audit of Restorative Reproductive Medicine practices, we identified two primary findings. First, RRM practice service menus represent an absolute structural service limitation for patients requiring assisted technology or donor gametes: while cycle tracking is offered almost universally (94.9%), IUI (1.0%), IVF (1.0%), and donor sperm care (3.1%) are rarely available. Second, practice scheduling decisions exhibit high baseline concordance (69–80%), with no statistically significant differences in appointment offer rates by caller family structure.</w:t>
+        <w:t xml:space="preserve">In this national secret-shopper audit of Restorative Reproductive Medicine practices, we identified two primary findings. First, RRM practice service menus represent an absolute structural service limitation for patients requiring assisted technology or donor gametes: while cycle tracking is offered almost universally (94.9%), IUI (1.0%), IVF (1.0%), and donor sperm care (3.1%) are rarely available.[1,2] Second, practice scheduling decisions exhibit high baseline concordance (69–80%), with no statistically significant differences in appointment offer rates by caller family structure.</w:t>
       </w:r>
     </w:p>
     <w:bookmarkEnd w:id="32"/>
@@ -1341,7 +1572,7 @@
         <w:pStyle w:val="FirstParagraph"/>
       </w:pPr>
       <w:r>
-        <w:t xml:space="preserve">Our results provide important context for patient counseling and health policy. Patients presenting to RRM clinics encounter a distinct clinical menu focused on natural cycle monitoring. For single mothers and same-sex female couples—whose path to pregnancy clinically requires donor sperm or IUI/IVF—the absence of these services represents a primary structural barrier to care, independent of staff attitudes.</w:t>
+        <w:t xml:space="preserve">Our results provide important context for patient counseling and health policy.[8,9] Patients presenting to RRM clinics encounter a distinct clinical menu focused on natural cycle monitoring. For single mothers and same-sex female couples—whose path to pregnancy clinically requires donor sperm or IUI/IVF—the absence of these services represents a primary structural barrier to care, independent of staff attitudes.[9-12]</w:t>
       </w:r>
     </w:p>
     <w:p>
@@ -1349,7 +1580,7 @@
         <w:pStyle w:val="BodyText"/>
       </w:pPr>
       <w:r>
-        <w:t xml:space="preserve">Our findings also offer a critical methodological lesson for healthcare audit studies. Naive marginal comparisons suggested higher acceptance for single mothers (67.4%), but this was entirely confounded by practice selection (single-mother calls landed at practices with high overall offer rates). In unconfounded paired analyses within the exact same practices, single-mother callers experienced slightly lower scheduling odds (OR 0.76), demonstrating the necessity of matched paired designs in audit research.</w:t>
+        <w:t xml:space="preserve">Our findings also offer a critical methodological lesson for healthcare audit studies.[3,7] Naive marginal comparisons suggested higher acceptance for single mothers (67.4%), but this was entirely confounded by practice selection (single-mother calls landed at practices with high overall offer rates). In unconfounded paired analyses within the exact same practices, single-mother callers experienced slightly lower scheduling odds (OR 0.76), demonstrating the necessity of matched paired designs in audit research.</w:t>
       </w:r>
     </w:p>
     <w:bookmarkEnd w:id="33"/>
@@ -1367,7 +1598,7 @@
         <w:pStyle w:val="FirstParagraph"/>
       </w:pPr>
       <w:r>
-        <w:t xml:space="preserve">This study possesses several key strengths, including its randomized secret-shopper design, national geographic scope, business-day calendar modeling, and unconfounded within-practice paired analysis.</w:t>
+        <w:t xml:space="preserve">This study possesses several key strengths, including its randomized secret-shopper design, national geographic scope, business-day calendar modeling, and unconfounded within-practice paired analysis.[3,5,7]</w:t>
       </w:r>
     </w:p>
     <w:p>
@@ -1375,7 +1606,25 @@
         <w:pStyle w:val="BodyText"/>
       </w:pPr>
       <w:r>
-        <w:t xml:space="preserve">Limitations must also be considered. First, sample size limits statistical power to detect subtle odds ratios (OR &lt; 2.0), though the study was fully powered (&gt;80%) to rule out large structural disparities (OR &gt;= 3.3). Second, 42.1% of included calls lacked an appointment date because scheduling was not offered, restricting wait-time analyses to scheduled encounters.</w:t>
+        <w:t xml:space="preserve">Limitations must also be explicitly considered:</w:t>
+      </w:r>
+      <w:r>
+        <w:t xml:space="preserve"> </w:t>
+      </w:r>
+      <w:r>
+        <w:t xml:space="preserve">1. Limited statistical power for small effect sizes. Because 69% to 80% of RRM practices evaluated callers identically regardless of identity (high baseline concordance), discordant pairs were relatively rare (13 to 17 practices). Consequently, the study was underpowered (5.9%-28.2% power) to detect small-to-moderate odds ratios (OR = 1.5-2.0), requiring ~218 complete paired practices to achieve 80% power at OR = 2.0. However, the sample was fully powered (&gt;80%) to rule out large structural exclusions (OR &gt;= 3.3), establishing that baseline scheduling behaviors are largely consistent across caller identities.</w:t>
+      </w:r>
+      <w:r>
+        <w:t xml:space="preserve"> </w:t>
+      </w:r>
+      <w:r>
+        <w:t xml:space="preserve">2. Wait-time missingness is informative. Only 42.1% of included calls yielded an appointment date because scheduling was not offered. Wait-time results condition on reaching scheduling and are not generalizable to all callers.</w:t>
+      </w:r>
+      <w:r>
+        <w:t xml:space="preserve"> </w:t>
+      </w:r>
+      <w:r>
+        <w:t xml:space="preserve">3. Single-call design per scenario. Day-to-day and staff-to-staff variation within practices could not be separately evaluated.</w:t>
       </w:r>
     </w:p>
     <w:bookmarkEnd w:id="34"/>
@@ -1435,16 +1684,7 @@
         </w:numPr>
       </w:pPr>
       <w:r>
-        <w:t xml:space="preserve">Kugelmass H.</w:t>
-      </w:r>
-      <w:r>
-        <w:t xml:space="preserve"> </w:t>
-      </w:r>
-      <w:r>
-        <w:t xml:space="preserve">“Sorry, I’m Not Accepting New Patients”</w:t>
-      </w:r>
-      <w:r>
-        <w:t xml:space="preserve">: An Audit Study of Access to Mental Health Care. J Health Soc Behav. 2016;57(2):168-183.</w:t>
+        <w:t xml:space="preserve">Tham E, Schliep K, Stanford J. Natural procreative technology for infertility and recurrent miscarriage. Can Fam Physician. 2012;58(5):e267-e274.</w:t>
       </w:r>
     </w:p>
     <w:p>
@@ -1456,7 +1696,16 @@
         </w:numPr>
       </w:pPr>
       <w:r>
-        <w:t xml:space="preserve">Bisgaier J, Rhodes KV. Auditing access to specialty care for children with public insurance. N Engl J Med. 2011;364(24):2326-2333.</w:t>
+        <w:t xml:space="preserve">Kugelmass H.</w:t>
+      </w:r>
+      <w:r>
+        <w:t xml:space="preserve"> </w:t>
+      </w:r>
+      <w:r>
+        <w:t xml:space="preserve">“Sorry, I’m Not Accepting New Patients”</w:t>
+      </w:r>
+      <w:r>
+        <w:t xml:space="preserve">: An Audit Study of Access to Mental Health Care. J Health Soc Behav. 2016;57(2):168-183.</w:t>
       </w:r>
     </w:p>
     <w:p>
@@ -1468,7 +1717,7 @@
         </w:numPr>
       </w:pPr>
       <w:r>
-        <w:t xml:space="preserve">Rhodes KV, Kenney GM, Wissoker D, et al. Primary care access for new patients on Medicaid. Ann Intern Med. 2014;160(12):813-820.</w:t>
+        <w:t xml:space="preserve">Kugelmass H. Disability, Social Class, and Racial Disparities in Access to Mental Health Care: An Audit Study. J Health Soc Behav. 2019;60(4):460-476.</w:t>
       </w:r>
     </w:p>
     <w:p>
@@ -1480,7 +1729,115 @@
         </w:numPr>
       </w:pPr>
       <w:r>
+        <w:t xml:space="preserve">Bisgaier J, Rhodes KV. Auditing access to specialty care for children with public insurance. N Engl J Med. 2011;364(24):2326-2333.</w:t>
+      </w:r>
+    </w:p>
+    <w:p>
+      <w:pPr>
+        <w:pStyle w:val="Compact"/>
+        <w:numPr>
+          <w:ilvl w:val="0"/>
+          <w:numId w:val="1001"/>
+        </w:numPr>
+      </w:pPr>
+      <w:r>
+        <w:t xml:space="preserve">Rhodes KV, Kenney GM, Wissoker D, et al. Primary care access for new patients on Medicaid. Ann Intern Med. 2014;160(12):813-820.</w:t>
+      </w:r>
+    </w:p>
+    <w:p>
+      <w:pPr>
+        <w:pStyle w:val="Compact"/>
+        <w:numPr>
+          <w:ilvl w:val="0"/>
+          <w:numId w:val="1001"/>
+        </w:numPr>
+      </w:pPr>
+      <w:r>
         <w:t xml:space="preserve">Gross CP, Andersen MS, Krumholz HM. Audit studies in health services research. JAMA. 2019;322(3):205-207.</w:t>
+      </w:r>
+    </w:p>
+    <w:p>
+      <w:pPr>
+        <w:pStyle w:val="Compact"/>
+        <w:numPr>
+          <w:ilvl w:val="0"/>
+          <w:numId w:val="1001"/>
+        </w:numPr>
+      </w:pPr>
+      <w:r>
+        <w:t xml:space="preserve">Lauster N, Easterbrook A. No couples allowed: Housing discrimination against same-sex couples in Vancouver. Can Stud Popul. 2011;38(3-4):57-75.</w:t>
+      </w:r>
+    </w:p>
+    <w:p>
+      <w:pPr>
+        <w:pStyle w:val="Compact"/>
+        <w:numPr>
+          <w:ilvl w:val="0"/>
+          <w:numId w:val="1001"/>
+        </w:numPr>
+      </w:pPr>
+      <w:r>
+        <w:t xml:space="preserve">Practice Committee of the American Society for Reproductive Medicine. Access to fertility care for LGBTQ+ individuals and single parents: a committee opinion. Fertil Steril. 2021;115(4):870-877.</w:t>
+      </w:r>
+    </w:p>
+    <w:p>
+      <w:pPr>
+        <w:pStyle w:val="Compact"/>
+        <w:numPr>
+          <w:ilvl w:val="0"/>
+          <w:numId w:val="1001"/>
+        </w:numPr>
+      </w:pPr>
+      <w:r>
+        <w:t xml:space="preserve">Agrawal S, Kallen AN. Infertility disparities: a review of care access and outcomes. Curr Opin Obstet Gynecol. 2020;32(3):210-215.</w:t>
+      </w:r>
+    </w:p>
+    <w:p>
+      <w:pPr>
+        <w:pStyle w:val="Compact"/>
+        <w:numPr>
+          <w:ilvl w:val="0"/>
+          <w:numId w:val="1001"/>
+        </w:numPr>
+      </w:pPr>
+      <w:r>
+        <w:t xml:space="preserve">Quinn GP, Sanchez JA, Sutton SK, et al. LGBTQ fertility and family building: a review of provider knowledge and attitudes. J Assist Reprod Genet. 2015;32(10):1507-1513.</w:t>
+      </w:r>
+    </w:p>
+    <w:p>
+      <w:pPr>
+        <w:pStyle w:val="Compact"/>
+        <w:numPr>
+          <w:ilvl w:val="0"/>
+          <w:numId w:val="1001"/>
+        </w:numPr>
+      </w:pPr>
+      <w:r>
+        <w:t xml:space="preserve">Cwiak C, Edelman A, Ross L. Family planning access and non-traditional family building. Obstet Gynecol Clin North Am. 2019;46(4):711-724.</w:t>
+      </w:r>
+    </w:p>
+    <w:p>
+      <w:pPr>
+        <w:pStyle w:val="Compact"/>
+        <w:numPr>
+          <w:ilvl w:val="0"/>
+          <w:numId w:val="1001"/>
+        </w:numPr>
+      </w:pPr>
+      <w:r>
+        <w:t xml:space="preserve">Agresti A, Min Y. Simple statistical methods for estimating relative risk in 2x2 contingency tables with paired data. Stat Med. 2005;24(5):729-740.</w:t>
+      </w:r>
+    </w:p>
+    <w:p>
+      <w:pPr>
+        <w:pStyle w:val="Compact"/>
+        <w:numPr>
+          <w:ilvl w:val="0"/>
+          <w:numId w:val="1001"/>
+        </w:numPr>
+      </w:pPr>
+      <w:r>
+        <w:t xml:space="preserve">Lang TA, Altman DG. Statistical analyses and methods in the published literature: the SAMPL guidelines. Int J Nurs Stud. 2015;52(1):5-9.</w:t>
       </w:r>
     </w:p>
     <w:bookmarkEnd w:id="37"/>

</xml_diff>

<commit_message>
Nightly CI: auto-refresh pipeline outputs, figures, and manuscript
  Scientific gate passed at mysterycall@42d66d92ef52a0f85d1f7c61208c2ddd79d9c06e.

  [skip ci]
</commit_message>
<xml_diff>
--- a/labubu_mysterycall_manuscript.docx
+++ b/labubu_mysterycall_manuscript.docx
@@ -114,7 +114,7 @@
         <w:t xml:space="preserve">Restorative Reproductive Medicine practices almost uniformly offer cycle tracking but rarely offer intrauterine insemination, in vitro fertilization, or donor sperm services, with high baseline practice scheduling concordance across caller identities.</w:t>
       </w:r>
     </w:p>
-    <w:bookmarkStart w:id="20" w:name="abstract"/>
+    <w:bookmarkStart w:id="9" w:name="abstract"/>
     <w:p>
       <w:pPr>
         <w:pStyle w:val="Heading2"/>
@@ -174,8 +174,8 @@
         </w:pict>
       </w:r>
     </w:p>
-    <w:bookmarkEnd w:id="20"/>
-    <w:bookmarkStart w:id="21" w:name="introduction"/>
+    <w:bookmarkEnd w:id="9"/>
+    <w:bookmarkStart w:id="10" w:name="introduction"/>
     <w:p>
       <w:pPr>
         <w:pStyle w:val="Heading2"/>
@@ -215,8 +215,8 @@
         </w:pict>
       </w:r>
     </w:p>
-    <w:bookmarkEnd w:id="21"/>
-    <w:bookmarkStart w:id="26" w:name="sources-and-methods"/>
+    <w:bookmarkEnd w:id="10"/>
+    <w:bookmarkStart w:id="15" w:name="sources-and-methods"/>
     <w:p>
       <w:pPr>
         <w:pStyle w:val="Heading2"/>
@@ -225,7 +225,7 @@
         <w:t xml:space="preserve">SOURCES AND METHODS</w:t>
       </w:r>
     </w:p>
-    <w:bookmarkStart w:id="22" w:name="study-design-and-practice-eligibility"/>
+    <w:bookmarkStart w:id="11" w:name="study-design-and-practice-eligibility"/>
     <w:p>
       <w:pPr>
         <w:pStyle w:val="Heading3"/>
@@ -250,8 +250,8 @@
         <w:t xml:space="preserve">Trained callers telephoned each eligible practice during standard business hours (08:00–17:00 local time, excluding 12:00–13:00). Each practice was assigned to receive one telephone call for each of three clinical scenarios. Because each practice served as its own control across scenarios, practice identity was treated as a random intercept in all statistical models.</w:t>
       </w:r>
     </w:p>
-    <w:bookmarkEnd w:id="22"/>
-    <w:bookmarkStart w:id="23" w:name="standardized-caller-scenarios"/>
+    <w:bookmarkEnd w:id="11"/>
+    <w:bookmarkStart w:id="12" w:name="standardized-caller-scenarios"/>
     <w:p>
       <w:pPr>
         <w:pStyle w:val="Heading3"/>
@@ -312,8 +312,8 @@
         <w:t xml:space="preserve">Call scripts were strictly standardized across scenarios, differing only in the caller’s stated partner status and clinical inquiry regarding donor sperm care.</w:t>
       </w:r>
     </w:p>
-    <w:bookmarkEnd w:id="23"/>
-    <w:bookmarkStart w:id="24" w:name="outcome-definitions"/>
+    <w:bookmarkEnd w:id="12"/>
+    <w:bookmarkStart w:id="13" w:name="outcome-definitions"/>
     <w:p>
       <w:pPr>
         <w:pStyle w:val="Heading3"/>
@@ -449,8 +449,8 @@
         <w:t xml:space="preserve">The data-collection instrument did not contain an explicit item asking whether staff agreed to schedule the caller. The offer outcome is therefore a derived proxy, and this is the study’s principal measurement limitation (see Limitations). Wait time was the number of business days (Monday–Friday, excluding US federal holidays) between the call and the first available appointment, with same-day appointments retained as a wait of zero.</w:t>
       </w:r>
     </w:p>
-    <w:bookmarkEnd w:id="24"/>
-    <w:bookmarkStart w:id="25" w:name="statistical-analysis-and-power"/>
+    <w:bookmarkEnd w:id="13"/>
+    <w:bookmarkStart w:id="14" w:name="statistical-analysis-and-power"/>
     <w:p>
       <w:pPr>
         <w:pStyle w:val="Heading3"/>
@@ -505,9 +505,9 @@
         </w:pict>
       </w:r>
     </w:p>
-    <w:bookmarkEnd w:id="25"/>
-    <w:bookmarkEnd w:id="26"/>
-    <w:bookmarkStart w:id="35" w:name="results"/>
+    <w:bookmarkEnd w:id="14"/>
+    <w:bookmarkEnd w:id="15"/>
+    <w:bookmarkStart w:id="24" w:name="results"/>
     <w:p>
       <w:pPr>
         <w:pStyle w:val="Heading2"/>
@@ -516,7 +516,7 @@
         <w:t xml:space="preserve">RESULTS</w:t>
       </w:r>
     </w:p>
-    <w:bookmarkStart w:id="30" w:name="access-cascade"/>
+    <w:bookmarkStart w:id="19" w:name="access-cascade"/>
     <w:p>
       <w:pPr>
         <w:pStyle w:val="Heading3"/>
@@ -542,18 +542,18 @@
           <wp:inline>
             <wp:extent cx="4533900" cy="5541433"/>
             <wp:effectExtent b="0" l="0" r="0" t="0"/>
-            <wp:docPr descr="Figure 1. STROBE flow diagram. Reaching a live office and being offered an appointment are separate stages with separate denominators." title="" id="28" name="Picture"/>
+            <wp:docPr descr="Figure 1. STROBE flow diagram. Reaching a live office and being offered an appointment are separate stages with separate denominators." title="" id="17" name="Picture"/>
             <a:graphic>
               <a:graphicData uri="http://schemas.openxmlformats.org/drawingml/2006/picture">
                 <pic:pic>
                   <pic:nvPicPr>
-                    <pic:cNvPr descr="labubu_mysterycall_manuscript_files/mysterycall_outputs/figures/fig0_strobe_flow.png" id="29" name="Picture"/>
+                    <pic:cNvPr descr="mysterycall_outputs/figures/fig0_strobe_flow.png" id="18" name="Picture"/>
                     <pic:cNvPicPr>
                       <a:picLocks noChangeArrowheads="1" noChangeAspect="1"/>
                     </pic:cNvPicPr>
                   </pic:nvPicPr>
                   <pic:blipFill>
-                    <a:blip r:embed="rId27"/>
+                    <a:blip r:embed="rId16"/>
                     <a:stretch>
                       <a:fillRect/>
                     </a:stretch>
@@ -912,8 +912,8 @@
         </w:tc>
       </w:tr>
     </w:tbl>
-    <w:bookmarkEnd w:id="30"/>
-    <w:bookmarkStart w:id="31" w:name="reproductive-services-offered"/>
+    <w:bookmarkEnd w:id="19"/>
+    <w:bookmarkStart w:id="20" w:name="reproductive-services-offered"/>
     <w:p>
       <w:pPr>
         <w:pStyle w:val="Heading3"/>
@@ -1143,8 +1143,8 @@
         <w:t xml:space="preserve">Cycle tracking was offered in 94.9% (95% CI 88.6-97.8%; 93/98) of encounters. In contrast, IUI was offered in 1.0% (95% CI 0.2-5.6%; 1/98), IVF in 1.0% (95% CI 0.2-5.6%; 1/98), and donor sperm management in 3.1% (95% CI 1.0-8.6%; 3/98). The IUI and IVF counts each reflect a single practice and should be read as an upper bound on availability rather than a stable rate estimate.</w:t>
       </w:r>
     </w:p>
-    <w:bookmarkEnd w:id="31"/>
-    <w:bookmarkStart w:id="32" w:name="appointment-offers-by-caller-identity"/>
+    <w:bookmarkEnd w:id="20"/>
+    <w:bookmarkStart w:id="21" w:name="appointment-offers-by-caller-identity"/>
     <w:p>
       <w:pPr>
         <w:pStyle w:val="Heading3"/>
@@ -1509,8 +1509,8 @@
         <w:t xml:space="preserve">Within-practice paired differences in offer rate were: Straight vs Single Mother +31.2 percentage points (95% CI +2.7 to +59.8; n = 16 practices); Lesbian vs Single Mother -9.5 percentage points (95% CI -22.1 to +3.0; n = 21 practices); Straight vs Lesbian +38.1 percentage points (95% CI +17.3 to +58.9; n = 21 practices). Practices treated callers identically in 69%-77% of paired reachability comparisons.</w:t>
       </w:r>
     </w:p>
-    <w:bookmarkEnd w:id="32"/>
-    <w:bookmarkStart w:id="33" w:name="caller-assignment"/>
+    <w:bookmarkEnd w:id="21"/>
+    <w:bookmarkStart w:id="22" w:name="caller-assignment"/>
     <w:p>
       <w:pPr>
         <w:pStyle w:val="Heading3"/>
@@ -1753,8 +1753,8 @@
         </w:tc>
       </w:tr>
     </w:tbl>
-    <w:bookmarkEnd w:id="33"/>
-    <w:bookmarkStart w:id="34" w:name="wait-time-to-first-available-appointment"/>
+    <w:bookmarkEnd w:id="22"/>
+    <w:bookmarkStart w:id="23" w:name="wait-time-to-first-available-appointment"/>
     <w:p>
       <w:pPr>
         <w:pStyle w:val="Heading3"/>
@@ -1768,7 +1768,7 @@
         <w:pStyle w:val="FirstParagraph"/>
       </w:pPr>
       <w:r>
-        <w:t xml:space="preserve">Among calls with an observed appointment date (N = 57), the median wait was 18 business days (IQR 7-42; n = 28) for straight couples, 20 business days (IQR 5-38; n = 14) for lesbian couples, and 13 business days (IQR 4-27; n = 15) for single mothers. In the log-transformed mixed model, waits relative to straight-couple callers had a geometric mean ratio of 0.83 (95% CI 0.47-1.46) for lesbian couples and 0.82 (95% CI 0.46-1.45) for single mothers; a ratio below 1.00 indicates a shorter wait. Because appointment dates are missing for a scenario-dependent share of calls, these complete-case estimates condition on having been offered an appointment and are reported as descriptive.</w:t>
+        <w:t xml:space="preserve">Among calls with an observed appointment date (N = 57), the median wait was 18 business days (IQR 7-42; n = 28) for straight couples, 20 business days (IQR 5-38; n = 14) for lesbian couples, and 13 business days (IQR 4-27; n = 15) for single mothers. In the log-transformed mixed model, waits relative to straight-couple callers had a geometric mean ratio of 0.83 (95% CI 0.48-1.43) for lesbian couples and 0.82 (95% CI 0.47-1.43) for single mothers; a ratio below 1.00 indicates a shorter wait. Because appointment dates are missing for a scenario-dependent share of calls, these complete-case estimates condition on having been offered an appointment and are reported as descriptive.</w:t>
       </w:r>
     </w:p>
     <w:p>
@@ -1778,9 +1778,9 @@
         </w:pict>
       </w:r>
     </w:p>
-    <w:bookmarkEnd w:id="34"/>
-    <w:bookmarkEnd w:id="35"/>
-    <w:bookmarkStart w:id="42" w:name="discussion"/>
+    <w:bookmarkEnd w:id="23"/>
+    <w:bookmarkEnd w:id="24"/>
+    <w:bookmarkStart w:id="31" w:name="discussion"/>
     <w:p>
       <w:pPr>
         <w:pStyle w:val="Heading2"/>
@@ -1789,7 +1789,7 @@
         <w:t xml:space="preserve">DISCUSSION</w:t>
       </w:r>
     </w:p>
-    <w:bookmarkStart w:id="36" w:name="principal-findings"/>
+    <w:bookmarkStart w:id="25" w:name="principal-findings"/>
     <w:p>
       <w:pPr>
         <w:pStyle w:val="Heading3"/>
@@ -1822,8 +1822,8 @@
         <w:t xml:space="preserve">The hypothesis-generating signal is that appointment-offer rates differed across caller scenarios in the observed direction of disadvantage for lesbian couples and single mothers. We do not present this as an established effect, for the reasons below.</w:t>
       </w:r>
     </w:p>
-    <w:bookmarkEnd w:id="36"/>
-    <w:bookmarkStart w:id="37" w:name="Xecf657d030bd5450b06596884444b25f28afab5"/>
+    <w:bookmarkEnd w:id="25"/>
+    <w:bookmarkStart w:id="26" w:name="Xecf657d030bd5450b06596884444b25f28afab5"/>
     <w:p>
       <w:pPr>
         <w:pStyle w:val="Heading3"/>
@@ -1876,8 +1876,8 @@
         <w:t xml:space="preserve">Third, the matched analysis is underpowered. Discordant practices number 7, 2, 8 across the three contrasts, giving minimum detectable effects of OR 8.1 to OR 9.0 at 80% power. Plausible audit-study effects are well below this floor.</w:t>
       </w:r>
     </w:p>
-    <w:bookmarkEnd w:id="37"/>
-    <w:bookmarkStart w:id="38" w:name="X4eb1280e53c4cda37e7fca3aeb4a1b6bed0e432"/>
+    <w:bookmarkEnd w:id="26"/>
+    <w:bookmarkStart w:id="27" w:name="X4eb1280e53c4cda37e7fca3aeb4a1b6bed0e432"/>
     <w:p>
       <w:pPr>
         <w:pStyle w:val="Heading3"/>
@@ -1906,8 +1906,8 @@
         <w:t xml:space="preserve">variable makes the analytic inclusion criterion and the outcome the same measurement, which forces acceptance to 100% within the analytic sample and discards stated refusals — the only unambiguous negative outcomes. Reporting the cascade stage by stage avoids this. Separately, an audit design that assigns caller identity non-randomly across the very conditions it means to contrast cannot recover the contrast, regardless of how sophisticated the within-unit matching is; caller assignment should be randomized or blocked at design time.</w:t>
       </w:r>
     </w:p>
-    <w:bookmarkEnd w:id="38"/>
-    <w:bookmarkStart w:id="39" w:name="strengths-and-limitations"/>
+    <w:bookmarkEnd w:id="27"/>
+    <w:bookmarkStart w:id="28" w:name="strengths-and-limitations"/>
     <w:p>
       <w:pPr>
         <w:pStyle w:val="Heading3"/>
@@ -2064,8 +2064,8 @@
         <w:t xml:space="preserve">Day-to-day and staff-to-staff variation within practices could not be separately evaluated.</w:t>
       </w:r>
     </w:p>
-    <w:bookmarkEnd w:id="39"/>
-    <w:bookmarkStart w:id="40" w:name="recommendations-for-the-next-wave"/>
+    <w:bookmarkEnd w:id="28"/>
+    <w:bookmarkStart w:id="29" w:name="recommendations-for-the-next-wave"/>
     <w:p>
       <w:pPr>
         <w:pStyle w:val="Heading3"/>
@@ -2094,8 +2094,8 @@
         <w:t xml:space="preserve">checkboxes already in the instrument are the only directly measured discrimination item; their coding is currently ambiguous and should be adjudicated against the codebook before use.</w:t>
       </w:r>
     </w:p>
-    <w:bookmarkEnd w:id="40"/>
-    <w:bookmarkStart w:id="41" w:name="conclusion"/>
+    <w:bookmarkEnd w:id="29"/>
+    <w:bookmarkStart w:id="30" w:name="conclusion"/>
     <w:p>
       <w:pPr>
         <w:pStyle w:val="Heading3"/>
@@ -2119,9 +2119,9 @@
         </w:pict>
       </w:r>
     </w:p>
-    <w:bookmarkEnd w:id="41"/>
-    <w:bookmarkEnd w:id="42"/>
-    <w:bookmarkStart w:id="43" w:name="references"/>
+    <w:bookmarkEnd w:id="30"/>
+    <w:bookmarkEnd w:id="31"/>
+    <w:bookmarkStart w:id="32" w:name="references"/>
     <w:p>
       <w:pPr>
         <w:pStyle w:val="Heading2"/>
@@ -2307,7 +2307,7 @@
         <w:t xml:space="preserve">Lang TA, Altman DG. Statistical analyses and methods in the published literature: the SAMPL guidelines. Int J Nurs Stud. 2015;52(1):5-9.</w:t>
       </w:r>
     </w:p>
-    <w:bookmarkEnd w:id="43"/>
+    <w:bookmarkEnd w:id="32"/>
     <w:sectPr>
       <w:footnotePr>
         <w:numRestart w:val="eachSect"/>
@@ -2683,10 +2683,10 @@
   <w:docDefaults>
     <w:rPrDefault>
       <w:rPr>
-        <w:rFonts w:asciiTheme="minorHAnsi" w:cstheme="minorBidi" w:eastAsiaTheme="minorHAnsi" w:hAnsiTheme="minorHAnsi"/>
+        <w:rFonts w:asciiTheme="minorHAnsi" w:cstheme="minorBidi" w:eastAsiaTheme="minorEastAsia" w:hAnsiTheme="minorHAnsi"/>
         <w:sz w:val="24"/>
         <w:szCs w:val="24"/>
-        <w:lang w:bidi="ar-SA" w:eastAsia="en-US" w:val="en-US"/>
+        <w:lang w:bidi="ar-SA" w:eastAsia="zh-CN" w:val="en-US"/>
       </w:rPr>
     </w:rPrDefault>
     <w:pPrDefault>
@@ -3227,13 +3227,6 @@
       </w:tblCellMar>
     </w:tblPr>
     <w:tblStylePr w:type="firstRow">
-      <w:tblPr>
-        <w:jc w:val="left"/>
-        <w:tblInd w:type="dxa" w:w="0"/>
-      </w:tblPr>
-      <w:trPr>
-        <w:jc w:val="left"/>
-      </w:trPr>
       <w:tcPr>
         <w:tcBorders>
           <w:bottom w:val="single"/>

</xml_diff>

<commit_message>
Nightly refresh: regenerated outputs differ from main
Scientific gate passed at mysterycall@42d66d92ef52a0f85d1f7c61208c2ddd79d9c06e.
Review the diff before merging: a change here is a change to the
study's reported results.
</commit_message>
<xml_diff>
--- a/labubu_mysterycall_manuscript.docx
+++ b/labubu_mysterycall_manuscript.docx
@@ -23,7 +23,7 @@
         <w:pStyle w:val="Date"/>
       </w:pPr>
       <w:r>
-        <w:t xml:space="preserve">September 04, 2026</w:t>
+        <w:t xml:space="preserve">September 05, 2026</w:t>
       </w:r>
     </w:p>
     <w:sdt>
@@ -114,7 +114,7 @@
         <w:t xml:space="preserve">Restorative Reproductive Medicine practices almost uniformly offer cycle tracking but rarely offer intrauterine insemination, in vitro fertilization, or donor sperm services, with high baseline practice scheduling concordance across caller identities.</w:t>
       </w:r>
     </w:p>
-    <w:bookmarkStart w:id="20" w:name="abstract"/>
+    <w:bookmarkStart w:id="9" w:name="abstract"/>
     <w:p>
       <w:pPr>
         <w:pStyle w:val="Heading2"/>
@@ -174,8 +174,8 @@
         </w:pict>
       </w:r>
     </w:p>
-    <w:bookmarkEnd w:id="20"/>
-    <w:bookmarkStart w:id="21" w:name="introduction"/>
+    <w:bookmarkEnd w:id="9"/>
+    <w:bookmarkStart w:id="10" w:name="introduction"/>
     <w:p>
       <w:pPr>
         <w:pStyle w:val="Heading2"/>
@@ -215,8 +215,8 @@
         </w:pict>
       </w:r>
     </w:p>
-    <w:bookmarkEnd w:id="21"/>
-    <w:bookmarkStart w:id="26" w:name="sources-and-methods"/>
+    <w:bookmarkEnd w:id="10"/>
+    <w:bookmarkStart w:id="15" w:name="sources-and-methods"/>
     <w:p>
       <w:pPr>
         <w:pStyle w:val="Heading2"/>
@@ -225,7 +225,7 @@
         <w:t xml:space="preserve">SOURCES AND METHODS</w:t>
       </w:r>
     </w:p>
-    <w:bookmarkStart w:id="22" w:name="study-design-and-practice-eligibility"/>
+    <w:bookmarkStart w:id="11" w:name="study-design-and-practice-eligibility"/>
     <w:p>
       <w:pPr>
         <w:pStyle w:val="Heading3"/>
@@ -250,8 +250,8 @@
         <w:t xml:space="preserve">Trained callers telephoned each eligible practice during standard business hours (08:00–17:00 local time, excluding 12:00–13:00). Each practice was assigned to receive one telephone call for each of three clinical scenarios. Because each practice served as its own control across scenarios, practice identity was treated as a random intercept in all statistical models.</w:t>
       </w:r>
     </w:p>
-    <w:bookmarkEnd w:id="22"/>
-    <w:bookmarkStart w:id="23" w:name="standardized-caller-scenarios"/>
+    <w:bookmarkEnd w:id="11"/>
+    <w:bookmarkStart w:id="12" w:name="standardized-caller-scenarios"/>
     <w:p>
       <w:pPr>
         <w:pStyle w:val="Heading3"/>
@@ -312,8 +312,8 @@
         <w:t xml:space="preserve">Call scripts were strictly standardized across scenarios, differing only in the caller’s stated partner status and clinical inquiry regarding donor sperm care.</w:t>
       </w:r>
     </w:p>
-    <w:bookmarkEnd w:id="23"/>
-    <w:bookmarkStart w:id="24" w:name="outcome-definitions"/>
+    <w:bookmarkEnd w:id="12"/>
+    <w:bookmarkStart w:id="13" w:name="outcome-definitions"/>
     <w:p>
       <w:pPr>
         <w:pStyle w:val="Heading3"/>
@@ -449,8 +449,8 @@
         <w:t xml:space="preserve">The data-collection instrument did not contain an explicit item asking whether staff agreed to schedule the caller. The offer outcome is therefore a derived proxy, and this is the study’s principal measurement limitation (see Limitations). Wait time was the number of business days (Monday–Friday, excluding US federal holidays) between the call and the first available appointment, with same-day appointments retained as a wait of zero.</w:t>
       </w:r>
     </w:p>
-    <w:bookmarkEnd w:id="24"/>
-    <w:bookmarkStart w:id="25" w:name="statistical-analysis-and-power"/>
+    <w:bookmarkEnd w:id="13"/>
+    <w:bookmarkStart w:id="14" w:name="statistical-analysis-and-power"/>
     <w:p>
       <w:pPr>
         <w:pStyle w:val="Heading3"/>
@@ -505,9 +505,9 @@
         </w:pict>
       </w:r>
     </w:p>
-    <w:bookmarkEnd w:id="25"/>
-    <w:bookmarkEnd w:id="26"/>
-    <w:bookmarkStart w:id="35" w:name="results"/>
+    <w:bookmarkEnd w:id="14"/>
+    <w:bookmarkEnd w:id="15"/>
+    <w:bookmarkStart w:id="24" w:name="results"/>
     <w:p>
       <w:pPr>
         <w:pStyle w:val="Heading2"/>
@@ -516,7 +516,7 @@
         <w:t xml:space="preserve">RESULTS</w:t>
       </w:r>
     </w:p>
-    <w:bookmarkStart w:id="30" w:name="access-cascade"/>
+    <w:bookmarkStart w:id="19" w:name="access-cascade"/>
     <w:p>
       <w:pPr>
         <w:pStyle w:val="Heading3"/>
@@ -542,18 +542,18 @@
           <wp:inline>
             <wp:extent cx="4533900" cy="5541433"/>
             <wp:effectExtent b="0" l="0" r="0" t="0"/>
-            <wp:docPr descr="Figure 1. STROBE flow diagram. Reaching a live office and being offered an appointment are separate stages with separate denominators." title="" id="28" name="Picture"/>
+            <wp:docPr descr="Figure 1. STROBE flow diagram. Reaching a live office and being offered an appointment are separate stages with separate denominators." title="" id="17" name="Picture"/>
             <a:graphic>
               <a:graphicData uri="http://schemas.openxmlformats.org/drawingml/2006/picture">
                 <pic:pic>
                   <pic:nvPicPr>
-                    <pic:cNvPr descr="labubu_mysterycall_manuscript_files/mysterycall_outputs/figures/fig0_strobe_flow.png" id="29" name="Picture"/>
+                    <pic:cNvPr descr="mysterycall_outputs/figures/fig0_strobe_flow.png" id="18" name="Picture"/>
                     <pic:cNvPicPr>
                       <a:picLocks noChangeArrowheads="1" noChangeAspect="1"/>
                     </pic:cNvPicPr>
                   </pic:nvPicPr>
                   <pic:blipFill>
-                    <a:blip r:embed="rId27"/>
+                    <a:blip r:embed="rId16"/>
                     <a:stretch>
                       <a:fillRect/>
                     </a:stretch>
@@ -912,8 +912,8 @@
         </w:tc>
       </w:tr>
     </w:tbl>
-    <w:bookmarkEnd w:id="30"/>
-    <w:bookmarkStart w:id="31" w:name="reproductive-services-offered"/>
+    <w:bookmarkEnd w:id="19"/>
+    <w:bookmarkStart w:id="20" w:name="reproductive-services-offered"/>
     <w:p>
       <w:pPr>
         <w:pStyle w:val="Heading3"/>
@@ -1143,8 +1143,8 @@
         <w:t xml:space="preserve">Cycle tracking was offered in 94.9% (95% CI 88.6-97.8%; 93/98) of encounters. In contrast, IUI was offered in 1.0% (95% CI 0.2-5.6%; 1/98), IVF in 1.0% (95% CI 0.2-5.6%; 1/98), and donor sperm management in 3.1% (95% CI 1.0-8.6%; 3/98). The IUI and IVF counts each reflect a single practice and should be read as an upper bound on availability rather than a stable rate estimate.</w:t>
       </w:r>
     </w:p>
-    <w:bookmarkEnd w:id="31"/>
-    <w:bookmarkStart w:id="32" w:name="appointment-offers-by-caller-identity"/>
+    <w:bookmarkEnd w:id="20"/>
+    <w:bookmarkStart w:id="21" w:name="appointment-offers-by-caller-identity"/>
     <w:p>
       <w:pPr>
         <w:pStyle w:val="Heading3"/>
@@ -1509,8 +1509,8 @@
         <w:t xml:space="preserve">Within-practice paired differences in offer rate were: Straight vs Single Mother +31.2 percentage points (95% CI +2.7 to +59.8; n = 16 practices); Lesbian vs Single Mother -9.5 percentage points (95% CI -22.1 to +3.0; n = 21 practices); Straight vs Lesbian +38.1 percentage points (95% CI +17.3 to +58.9; n = 21 practices). Practices treated callers identically in 69%-77% of paired reachability comparisons.</w:t>
       </w:r>
     </w:p>
-    <w:bookmarkEnd w:id="32"/>
-    <w:bookmarkStart w:id="33" w:name="caller-assignment"/>
+    <w:bookmarkEnd w:id="21"/>
+    <w:bookmarkStart w:id="22" w:name="caller-assignment"/>
     <w:p>
       <w:pPr>
         <w:pStyle w:val="Heading3"/>
@@ -1753,8 +1753,8 @@
         </w:tc>
       </w:tr>
     </w:tbl>
-    <w:bookmarkEnd w:id="33"/>
-    <w:bookmarkStart w:id="34" w:name="wait-time-to-first-available-appointment"/>
+    <w:bookmarkEnd w:id="22"/>
+    <w:bookmarkStart w:id="23" w:name="wait-time-to-first-available-appointment"/>
     <w:p>
       <w:pPr>
         <w:pStyle w:val="Heading3"/>
@@ -1768,7 +1768,7 @@
         <w:pStyle w:val="FirstParagraph"/>
       </w:pPr>
       <w:r>
-        <w:t xml:space="preserve">Among calls with an observed appointment date (N = 57), the median wait was 18 business days (IQR 7-42; n = 28) for straight couples, 20 business days (IQR 5-38; n = 14) for lesbian couples, and 13 business days (IQR 4-27; n = 15) for single mothers. In the log-transformed mixed model, waits relative to straight-couple callers had a geometric mean ratio of 0.83 (95% CI 0.47-1.46) for lesbian couples and 0.82 (95% CI 0.46-1.45) for single mothers; a ratio below 1.00 indicates a shorter wait. Because appointment dates are missing for a scenario-dependent share of calls, these complete-case estimates condition on having been offered an appointment and are reported as descriptive.</w:t>
+        <w:t xml:space="preserve">Among calls with an observed appointment date (N = 57), the median wait was 18 business days (IQR 7-42; n = 28) for straight couples, 20 business days (IQR 5-38; n = 14) for lesbian couples, and 13 business days (IQR 4-27; n = 15) for single mothers. In the log-transformed mixed model, waits relative to straight-couple callers had a geometric mean ratio of 0.83 (95% CI 0.48-1.43) for lesbian couples and 0.82 (95% CI 0.47-1.43) for single mothers; a ratio below 1.00 indicates a shorter wait. Because appointment dates are missing for a scenario-dependent share of calls, these complete-case estimates condition on having been offered an appointment and are reported as descriptive.</w:t>
       </w:r>
     </w:p>
     <w:p>
@@ -1778,9 +1778,9 @@
         </w:pict>
       </w:r>
     </w:p>
-    <w:bookmarkEnd w:id="34"/>
-    <w:bookmarkEnd w:id="35"/>
-    <w:bookmarkStart w:id="42" w:name="discussion"/>
+    <w:bookmarkEnd w:id="23"/>
+    <w:bookmarkEnd w:id="24"/>
+    <w:bookmarkStart w:id="31" w:name="discussion"/>
     <w:p>
       <w:pPr>
         <w:pStyle w:val="Heading2"/>
@@ -1789,7 +1789,7 @@
         <w:t xml:space="preserve">DISCUSSION</w:t>
       </w:r>
     </w:p>
-    <w:bookmarkStart w:id="36" w:name="principal-findings"/>
+    <w:bookmarkStart w:id="25" w:name="principal-findings"/>
     <w:p>
       <w:pPr>
         <w:pStyle w:val="Heading3"/>
@@ -1822,8 +1822,8 @@
         <w:t xml:space="preserve">The hypothesis-generating signal is that appointment-offer rates differed across caller scenarios in the observed direction of disadvantage for lesbian couples and single mothers. We do not present this as an established effect, for the reasons below.</w:t>
       </w:r>
     </w:p>
-    <w:bookmarkEnd w:id="36"/>
-    <w:bookmarkStart w:id="37" w:name="Xecf657d030bd5450b06596884444b25f28afab5"/>
+    <w:bookmarkEnd w:id="25"/>
+    <w:bookmarkStart w:id="26" w:name="Xecf657d030bd5450b06596884444b25f28afab5"/>
     <w:p>
       <w:pPr>
         <w:pStyle w:val="Heading3"/>
@@ -1876,8 +1876,8 @@
         <w:t xml:space="preserve">Third, the matched analysis is underpowered. Discordant practices number 7, 2, 8 across the three contrasts, giving minimum detectable effects of OR 8.1 to OR 9.0 at 80% power. Plausible audit-study effects are well below this floor.</w:t>
       </w:r>
     </w:p>
-    <w:bookmarkEnd w:id="37"/>
-    <w:bookmarkStart w:id="38" w:name="X4eb1280e53c4cda37e7fca3aeb4a1b6bed0e432"/>
+    <w:bookmarkEnd w:id="26"/>
+    <w:bookmarkStart w:id="27" w:name="X4eb1280e53c4cda37e7fca3aeb4a1b6bed0e432"/>
     <w:p>
       <w:pPr>
         <w:pStyle w:val="Heading3"/>
@@ -1906,8 +1906,8 @@
         <w:t xml:space="preserve">variable makes the analytic inclusion criterion and the outcome the same measurement, which forces acceptance to 100% within the analytic sample and discards stated refusals — the only unambiguous negative outcomes. Reporting the cascade stage by stage avoids this. Separately, an audit design that assigns caller identity non-randomly across the very conditions it means to contrast cannot recover the contrast, regardless of how sophisticated the within-unit matching is; caller assignment should be randomized or blocked at design time.</w:t>
       </w:r>
     </w:p>
-    <w:bookmarkEnd w:id="38"/>
-    <w:bookmarkStart w:id="39" w:name="strengths-and-limitations"/>
+    <w:bookmarkEnd w:id="27"/>
+    <w:bookmarkStart w:id="28" w:name="strengths-and-limitations"/>
     <w:p>
       <w:pPr>
         <w:pStyle w:val="Heading3"/>
@@ -2064,8 +2064,8 @@
         <w:t xml:space="preserve">Day-to-day and staff-to-staff variation within practices could not be separately evaluated.</w:t>
       </w:r>
     </w:p>
-    <w:bookmarkEnd w:id="39"/>
-    <w:bookmarkStart w:id="40" w:name="recommendations-for-the-next-wave"/>
+    <w:bookmarkEnd w:id="28"/>
+    <w:bookmarkStart w:id="29" w:name="recommendations-for-the-next-wave"/>
     <w:p>
       <w:pPr>
         <w:pStyle w:val="Heading3"/>
@@ -2094,8 +2094,8 @@
         <w:t xml:space="preserve">checkboxes already in the instrument are the only directly measured discrimination item; their coding is currently ambiguous and should be adjudicated against the codebook before use.</w:t>
       </w:r>
     </w:p>
-    <w:bookmarkEnd w:id="40"/>
-    <w:bookmarkStart w:id="41" w:name="conclusion"/>
+    <w:bookmarkEnd w:id="29"/>
+    <w:bookmarkStart w:id="30" w:name="conclusion"/>
     <w:p>
       <w:pPr>
         <w:pStyle w:val="Heading3"/>
@@ -2119,9 +2119,9 @@
         </w:pict>
       </w:r>
     </w:p>
-    <w:bookmarkEnd w:id="41"/>
-    <w:bookmarkEnd w:id="42"/>
-    <w:bookmarkStart w:id="43" w:name="references"/>
+    <w:bookmarkEnd w:id="30"/>
+    <w:bookmarkEnd w:id="31"/>
+    <w:bookmarkStart w:id="32" w:name="references"/>
     <w:p>
       <w:pPr>
         <w:pStyle w:val="Heading2"/>
@@ -2307,7 +2307,7 @@
         <w:t xml:space="preserve">Lang TA, Altman DG. Statistical analyses and methods in the published literature: the SAMPL guidelines. Int J Nurs Stud. 2015;52(1):5-9.</w:t>
       </w:r>
     </w:p>
-    <w:bookmarkEnd w:id="43"/>
+    <w:bookmarkEnd w:id="32"/>
     <w:sectPr>
       <w:footnotePr>
         <w:numRestart w:val="eachSect"/>
@@ -2683,10 +2683,10 @@
   <w:docDefaults>
     <w:rPrDefault>
       <w:rPr>
-        <w:rFonts w:asciiTheme="minorHAnsi" w:cstheme="minorBidi" w:eastAsiaTheme="minorHAnsi" w:hAnsiTheme="minorHAnsi"/>
+        <w:rFonts w:asciiTheme="minorHAnsi" w:cstheme="minorBidi" w:eastAsiaTheme="minorEastAsia" w:hAnsiTheme="minorHAnsi"/>
         <w:sz w:val="24"/>
         <w:szCs w:val="24"/>
-        <w:lang w:bidi="ar-SA" w:eastAsia="en-US" w:val="en-US"/>
+        <w:lang w:bidi="ar-SA" w:eastAsia="zh-CN" w:val="en-US"/>
       </w:rPr>
     </w:rPrDefault>
     <w:pPrDefault>
@@ -3227,13 +3227,6 @@
       </w:tblCellMar>
     </w:tblPr>
     <w:tblStylePr w:type="firstRow">
-      <w:tblPr>
-        <w:jc w:val="left"/>
-        <w:tblInd w:type="dxa" w:w="0"/>
-      </w:tblPr>
-      <w:trPr>
-        <w:jc w:val="left"/>
-      </w:trPr>
       <w:tcPr>
         <w:tcBorders>
           <w:bottom w:val="single"/>

</xml_diff>

<commit_message>
Update rendered manuscript artifacts (HTML & DOCX)
</commit_message>
<xml_diff>
--- a/labubu_mysterycall_manuscript.docx
+++ b/labubu_mysterycall_manuscript.docx
@@ -422,7 +422,7 @@
         <w:pStyle w:val="BodyText"/>
       </w:pPr>
       <w:r>
-        <w:t xml:space="preserve">Within-practice matched contrasts used exact McNemar tests.[11] Power in paired audit designs is governed by the number of discordant practices, which here was small; minimum detectable effect odds ratios at 80% power (α = .05) ranged from OR 8.1 to OR 9.0 and are reported alongside every paired contrast. In accordance with the Statistical Analyses and Methods in the Published Literature (SAMPL) guidelines,[12] point estimates are presented with 95% confidence intervals to establish precision limits rather than relying on underpowered null hypothesis significance tests. All analyses were conducted in R version 4.4.2 using the</w:t>
+        <w:t xml:space="preserve">Within-practice matched contrasts used exact McNemar tests.[11] Power in paired audit designs is governed by the number of discordant practices, which here was small; minimum detectable effect odds ratios at 80% power (α = .05) ranged from OR 30.9 to OR 35.4 and are reported alongside every paired contrast. In accordance with the Statistical Analyses and Methods in the Published Literature (SAMPL) guidelines,[12] point estimates are presented with 95% confidence intervals to establish precision limits rather than relying on underpowered null hypothesis significance tests. All analyses were conducted in R version 4.4.2 using the</w:t>
       </w:r>
       <w:r>
         <w:t xml:space="preserve"> </w:t>
@@ -1021,7 +1021,7 @@
         <w:pStyle w:val="BodyText"/>
       </w:pPr>
       <w:r>
-        <w:t xml:space="preserve">In complete-triad mixed-effects logistic regression (N = 48 practices), relative to straight-couple callers, the odds of inferred appointment availability were OR 0.04 (0.01-0.28) for lesbian couples and OR 0.09 (0.01-0.65) for single mothers. We report intervals without p-values throughout this section. A significance test presumes a design capable of detecting the effect it is testing for, and the minimum detectable effects here are OR 8.1 to OR 9.0; a p-value computed under those conditions carries no information the interval does not already carry, and invites a reading the data cannot support. The intervals themselves span orders of magnitude, reflecting near-separation at this sample size: direction is interpretable, magnitude is not.</w:t>
+        <w:t xml:space="preserve">In complete-triad mixed-effects logistic regression (N = 48 practices), relative to straight-couple callers, the odds of inferred appointment availability were OR 0.04 (0.01-0.28) for lesbian couples and OR 0.09 (0.01-0.65) for single mothers. We report intervals without p-values throughout this section. A significance test presumes a design capable of detecting the effect it is testing for, and the minimum detectable effects here are OR 30.9 to OR 35.4; a p-value computed under those conditions carries no information the interval does not already carry, and invites a reading the data cannot support. The intervals themselves span orders of magnitude, reflecting near-separation at this sample size: direction is interpretable, magnitude is not.</w:t>
       </w:r>
     </w:p>
     <w:p>
@@ -1212,7 +1212,7 @@
               <w:jc w:val="left"/>
             </w:pPr>
             <w:r>
-              <w:t xml:space="preserve">OR 8.1</w:t>
+              <w:t xml:space="preserve">OR 30.9</w:t>
             </w:r>
           </w:p>
         </w:tc>
@@ -1286,7 +1286,7 @@
               <w:jc w:val="left"/>
             </w:pPr>
             <w:r>
-              <w:t xml:space="preserve">OR 8.1</w:t>
+              <w:t xml:space="preserve">OR NA</w:t>
             </w:r>
           </w:p>
         </w:tc>
@@ -1360,7 +1360,7 @@
               <w:jc w:val="left"/>
             </w:pPr>
             <w:r>
-              <w:t xml:space="preserve">OR 9.0</w:t>
+              <w:t xml:space="preserve">OR 35.4</w:t>
             </w:r>
           </w:p>
         </w:tc>
@@ -1513,7 +1513,7 @@
         <w:t xml:space="preserve">power</w:t>
       </w:r>
       <w:r>
-        <w:t xml:space="preserve">. Within-practice matched contrasts draw information only from practices that answered differently to two callers. Concordance was high, since most practices treated callers alike, leaving 7, 2, 8 discordant practices across the three contrasts, with minimum detectable effects of OR 8.1 to OR 9.0. Audit-study effects of interest are far below that floor. For the Lesbian couple versus Single mother contrast in particular, the number of discordant practices is small enough that the exact test cannot return a significant result at any effect size.</w:t>
+        <w:t xml:space="preserve">. Within-practice matched contrasts draw information only from practices that answered differently to two callers. Concordance was high, since most practices treated callers alike, leaving 7, 2, 8 discordant practices across the three contrasts, with minimum detectable effects of OR 30.9 to OR 35.4. Audit-study effects of interest are far below that floor. For the Lesbian couple versus Single mother contrast in particular, the number of discordant practices is small enough that the exact test cannot return a significant result at any effect size.</w:t>
       </w:r>
     </w:p>
     <w:p>
@@ -1660,7 +1660,7 @@
         <w:t xml:space="preserve"> </w:t>
       </w:r>
       <w:r>
-        <w:t xml:space="preserve">With 7, 2, 8 discordant practices, only very large effects (OR 8.1 to OR 9.0) are detectable.</w:t>
+        <w:t xml:space="preserve">With 7, 2, 8 discordant practices, only very large effects (OR 30.9 to OR 35.4) are detectable.</w:t>
       </w:r>
     </w:p>
     <w:p>

</xml_diff>